<commit_message>
Material pratico 2 - LP
</commit_message>
<xml_diff>
--- a/UNIUBE-LP/Conteudo.docx
+++ b/UNIUBE-LP/Conteudo.docx
@@ -86,7 +86,7 @@
     <w:p>
       <w:r>
         <w:pict w14:anchorId="58E19CF7">
-          <v:rect id="_x0000_i1026" style="width:0;height:1.5pt" o:hralign="center" o:hrstd="t" o:hr="t" fillcolor="#a0a0a0" stroked="f"/>
+          <v:rect id="_x0000_i1025" style="width:0;height:1.5pt" o:hralign="center" o:hrstd="t" o:hr="t" fillcolor="#a0a0a0" stroked="f"/>
         </w:pict>
       </w:r>
     </w:p>
@@ -240,7 +240,7 @@
     <w:p>
       <w:r>
         <w:pict w14:anchorId="624FA6B7">
-          <v:rect id="_x0000_i1027" style="width:0;height:1.5pt" o:hralign="center" o:hrstd="t" o:hr="t" fillcolor="#a0a0a0" stroked="f"/>
+          <v:rect id="_x0000_i1026" style="width:0;height:1.5pt" o:hralign="center" o:hrstd="t" o:hr="t" fillcolor="#a0a0a0" stroked="f"/>
         </w:pict>
       </w:r>
     </w:p>
@@ -349,7 +349,7 @@
     <w:p>
       <w:r>
         <w:pict w14:anchorId="24BBA568">
-          <v:rect id="_x0000_i1028" style="width:0;height:1.5pt" o:hralign="center" o:hrstd="t" o:hr="t" fillcolor="#a0a0a0" stroked="f"/>
+          <v:rect id="_x0000_i1027" style="width:0;height:1.5pt" o:hralign="center" o:hrstd="t" o:hr="t" fillcolor="#a0a0a0" stroked="f"/>
         </w:pict>
       </w:r>
     </w:p>
@@ -456,7 +456,7 @@
     <w:p>
       <w:r>
         <w:pict w14:anchorId="4DC541F9">
-          <v:rect id="_x0000_i1029" style="width:0;height:1.5pt" o:hralign="center" o:hrstd="t" o:hr="t" fillcolor="#a0a0a0" stroked="f"/>
+          <v:rect id="_x0000_i1028" style="width:0;height:1.5pt" o:hralign="center" o:hrstd="t" o:hr="t" fillcolor="#a0a0a0" stroked="f"/>
         </w:pict>
       </w:r>
     </w:p>
@@ -550,7 +550,7 @@
     <w:p>
       <w:r>
         <w:pict w14:anchorId="2380DA54">
-          <v:rect id="_x0000_i1030" style="width:0;height:1.5pt" o:hralign="center" o:bullet="t" o:hrstd="t" o:hr="t" fillcolor="#a0a0a0" stroked="f"/>
+          <v:rect id="_x0000_i1029" style="width:0;height:1.5pt" o:hralign="center" o:bullet="t" o:hrstd="t" o:hr="t" fillcolor="#a0a0a0" stroked="f"/>
         </w:pict>
       </w:r>
     </w:p>
@@ -643,7 +643,7 @@
     <w:p>
       <w:r>
         <w:pict w14:anchorId="21449F6F">
-          <v:rect id="_x0000_i1031" style="width:0;height:1.5pt" o:hralign="center" o:hrstd="t" o:hr="t" fillcolor="#a0a0a0" stroked="f"/>
+          <v:rect id="_x0000_i1030" style="width:0;height:1.5pt" o:hralign="center" o:hrstd="t" o:hr="t" fillcolor="#a0a0a0" stroked="f"/>
         </w:pict>
       </w:r>
     </w:p>
@@ -774,7 +774,7 @@
     <w:p>
       <w:r>
         <w:pict w14:anchorId="60A533C6">
-          <v:rect id="_x0000_i1032" style="width:0;height:1.5pt" o:hralign="center" o:hrstd="t" o:hr="t" fillcolor="#a0a0a0" stroked="f"/>
+          <v:rect id="_x0000_i1031" style="width:0;height:1.5pt" o:hralign="center" o:hrstd="t" o:hr="t" fillcolor="#a0a0a0" stroked="f"/>
         </w:pict>
       </w:r>
     </w:p>
@@ -891,7 +891,7 @@
 <w:numbering xmlns:wpc="http://schemas.microsoft.com/office/word/2010/wordprocessingCanvas" xmlns:cx="http://schemas.microsoft.com/office/drawing/2014/chartex" xmlns:cx1="http://schemas.microsoft.com/office/drawing/2015/9/8/chartex" xmlns:cx2="http://schemas.microsoft.com/office/drawing/2015/10/21/chartex" xmlns:cx3="http://schemas.microsoft.com/office/drawing/2016/5/9/chartex" xmlns:cx4="http://schemas.microsoft.com/office/drawing/2016/5/10/chartex" xmlns:cx5="http://schemas.microsoft.com/office/drawing/2016/5/11/chartex" xmlns:cx6="http://schemas.microsoft.com/office/drawing/2016/5/12/chartex" xmlns:cx7="http://schemas.microsoft.com/office/drawing/2016/5/13/chartex" xmlns:cx8="http://schemas.microsoft.com/office/drawing/2016/5/14/chartex" xmlns:mc="http://schemas.openxmlformats.org/markup-compatibility/2006" xmlns:aink="http://schemas.microsoft.com/office/drawing/2016/ink" xmlns:am3d="http://schemas.microsoft.com/office/drawing/2017/model3d" xmlns:o="urn:schemas-microsoft-com:office:office" xmlns:oel="http://schemas.microsoft.com/office/2019/extlst" xmlns:r="http://schemas.openxmlformats.org/officeDocument/2006/relationships" xmlns:m="http://schemas.openxmlformats.org/officeDocument/2006/math" xmlns:v="urn:schemas-microsoft-com:vml" xmlns:wp14="http://schemas.microsoft.com/office/word/2010/wordprocessingDrawing" xmlns:wp="http://schemas.openxmlformats.org/drawingml/2006/wordprocessingDrawing" xmlns:w10="urn:schemas-microsoft-com:office:word" xmlns:w="http://schemas.openxmlformats.org/wordprocessingml/2006/main" xmlns:w14="http://schemas.microsoft.com/office/word/2010/wordml" xmlns:w15="http://schemas.microsoft.com/office/word/2012/wordml" xmlns:w16cex="http://schemas.microsoft.com/office/word/2018/wordml/cex" xmlns:w16cid="http://schemas.microsoft.com/office/word/2016/wordml/cid" xmlns:w16="http://schemas.microsoft.com/office/word/2018/wordml" xmlns:w16du="http://schemas.microsoft.com/office/word/2023/wordml/word16du" xmlns:w16sdtdh="http://schemas.microsoft.com/office/word/2020/wordml/sdtdatahash" xmlns:w16sdtfl="http://schemas.microsoft.com/office/word/2024/wordml/sdtformatlock" xmlns:w16se="http://schemas.microsoft.com/office/word/2015/wordml/symex" xmlns:wpg="http://schemas.microsoft.com/office/word/2010/wordprocessingGroup" xmlns:wpi="http://schemas.microsoft.com/office/word/2010/wordprocessingInk" xmlns:wne="http://schemas.microsoft.com/office/word/2006/wordml" xmlns:wps="http://schemas.microsoft.com/office/word/2010/wordprocessingShape" mc:Ignorable="w14 w15 w16se w16cid w16 w16cex w16sdtdh w16sdtfl w16du wp14">
   <w:numPicBullet w:numPicBulletId="0">
     <w:pict>
-      <v:rect id="_x0000_i1027" style="width:0;height:1.5pt" o:hralign="center" o:bullet="t" o:hrstd="t" o:hr="t" fillcolor="#a0a0a0" stroked="f"/>
+      <v:rect id="_x0000_i1028" style="width:0;height:1.5pt" o:hralign="center" o:bullet="t" o:hrstd="t" o:hr="t" fillcolor="#a0a0a0" stroked="f"/>
     </w:pict>
   </w:numPicBullet>
   <w:abstractNum w:abstractNumId="0" w15:restartNumberingAfterBreak="0">

</xml_diff>

<commit_message>
Aula 2 de LP
</commit_message>
<xml_diff>
--- a/UNIUBE-LP/Conteudo.docx
+++ b/UNIUBE-LP/Conteudo.docx
@@ -36,15 +36,7 @@
         <w:t>Linguagens de programação</w:t>
       </w:r>
       <w:r>
-        <w:t>/</w:t>
-      </w:r>
-      <w:proofErr w:type="spellStart"/>
-      <w:r>
-        <w:t>Pseudo-Código</w:t>
-      </w:r>
-      <w:proofErr w:type="spellEnd"/>
-      <w:r>
-        <w:t xml:space="preserve"> /Algoritmos</w:t>
+        <w:t>/Pseudo-Código /Algoritmos</w:t>
       </w:r>
     </w:p>
     <w:p>
@@ -86,7 +78,7 @@
     <w:p>
       <w:r>
         <w:pict w14:anchorId="58E19CF7">
-          <v:rect id="_x0000_i1025" style="width:0;height:1.5pt" o:hralign="center" o:hrstd="t" o:hr="t" fillcolor="#a0a0a0" stroked="f"/>
+          <v:rect id="_x0000_i1026" style="width:0;height:1.5pt" o:hralign="center" o:hrstd="t" o:hr="t" fillcolor="#a0a0a0" stroked="f"/>
         </w:pict>
       </w:r>
     </w:p>
@@ -138,7 +130,6 @@
       <w:r>
         <w:t xml:space="preserve"> – </w:t>
       </w:r>
-      <w:proofErr w:type="spellStart"/>
       <w:r>
         <w:rPr>
           <w:b/>
@@ -146,7 +137,6 @@
         </w:rPr>
         <w:t>DevC</w:t>
       </w:r>
-      <w:proofErr w:type="spellEnd"/>
       <w:r>
         <w:rPr>
           <w:b/>
@@ -164,6 +154,18 @@
         <w:spacing w:after="0"/>
       </w:pPr>
       <w:r>
+        <w:t>Palavras reservadas</w:t>
+      </w:r>
+    </w:p>
+    <w:p>
+      <w:pPr>
+        <w:numPr>
+          <w:ilvl w:val="0"/>
+          <w:numId w:val="10"/>
+        </w:numPr>
+        <w:spacing w:after="0"/>
+      </w:pPr>
+      <w:r>
         <w:t xml:space="preserve">Variáveis </w:t>
       </w:r>
       <w:r>
@@ -206,23 +208,7 @@
         <w:spacing w:after="0"/>
       </w:pPr>
       <w:r>
-        <w:t>Entrada e saída (</w:t>
-      </w:r>
-      <w:proofErr w:type="spellStart"/>
-      <w:r>
-        <w:t>printf</w:t>
-      </w:r>
-      <w:proofErr w:type="spellEnd"/>
-      <w:r>
-        <w:t xml:space="preserve"> e </w:t>
-      </w:r>
-      <w:proofErr w:type="spellStart"/>
-      <w:r>
-        <w:t>scanf</w:t>
-      </w:r>
-      <w:proofErr w:type="spellEnd"/>
-      <w:r>
-        <w:t xml:space="preserve">) </w:t>
+        <w:t xml:space="preserve">Entrada e saída (printf e scanf) </w:t>
       </w:r>
     </w:p>
     <w:p>
@@ -240,7 +226,7 @@
     <w:p>
       <w:r>
         <w:pict w14:anchorId="624FA6B7">
-          <v:rect id="_x0000_i1026" style="width:0;height:1.5pt" o:hralign="center" o:hrstd="t" o:hr="t" fillcolor="#a0a0a0" stroked="f"/>
+          <v:rect id="_x0000_i1027" style="width:0;height:1.5pt" o:hralign="center" o:hrstd="t" o:hr="t" fillcolor="#a0a0a0" stroked="f"/>
         </w:pict>
       </w:r>
     </w:p>
@@ -267,13 +253,8 @@
         </w:numPr>
         <w:spacing w:after="0"/>
       </w:pPr>
-      <w:proofErr w:type="spellStart"/>
-      <w:r>
-        <w:t>if</w:t>
-      </w:r>
-      <w:proofErr w:type="spellEnd"/>
-      <w:r>
-        <w:t xml:space="preserve"> </w:t>
+      <w:r>
+        <w:t xml:space="preserve">if </w:t>
       </w:r>
     </w:p>
     <w:p>
@@ -284,13 +265,8 @@
         </w:numPr>
         <w:spacing w:after="0"/>
       </w:pPr>
-      <w:proofErr w:type="spellStart"/>
-      <w:r>
-        <w:t>if-else</w:t>
-      </w:r>
-      <w:proofErr w:type="spellEnd"/>
-      <w:r>
-        <w:t xml:space="preserve"> </w:t>
+      <w:r>
+        <w:t xml:space="preserve">if-else </w:t>
       </w:r>
     </w:p>
     <w:p>
@@ -301,13 +277,8 @@
         </w:numPr>
         <w:spacing w:after="0"/>
       </w:pPr>
-      <w:proofErr w:type="spellStart"/>
-      <w:r>
-        <w:t>else-if</w:t>
-      </w:r>
-      <w:proofErr w:type="spellEnd"/>
-      <w:r>
-        <w:t xml:space="preserve"> </w:t>
+      <w:r>
+        <w:t xml:space="preserve">else-if </w:t>
       </w:r>
     </w:p>
     <w:p>
@@ -349,7 +320,7 @@
     <w:p>
       <w:r>
         <w:pict w14:anchorId="24BBA568">
-          <v:rect id="_x0000_i1027" style="width:0;height:1.5pt" o:hralign="center" o:hrstd="t" o:hr="t" fillcolor="#a0a0a0" stroked="f"/>
+          <v:rect id="_x0000_i1028" style="width:0;height:1.5pt" o:hralign="center" o:hrstd="t" o:hr="t" fillcolor="#a0a0a0" stroked="f"/>
         </w:pict>
       </w:r>
     </w:p>
@@ -376,13 +347,8 @@
         </w:numPr>
         <w:spacing w:after="0"/>
       </w:pPr>
-      <w:proofErr w:type="spellStart"/>
-      <w:r>
-        <w:t>while</w:t>
-      </w:r>
-      <w:proofErr w:type="spellEnd"/>
-      <w:r>
-        <w:t xml:space="preserve"> </w:t>
+      <w:r>
+        <w:t xml:space="preserve">while </w:t>
       </w:r>
     </w:p>
     <w:p>
@@ -394,15 +360,7 @@
         <w:spacing w:after="0"/>
       </w:pPr>
       <w:r>
-        <w:t>do-</w:t>
-      </w:r>
-      <w:proofErr w:type="spellStart"/>
-      <w:r>
-        <w:t>while</w:t>
-      </w:r>
-      <w:proofErr w:type="spellEnd"/>
-      <w:r>
-        <w:t xml:space="preserve"> </w:t>
+        <w:t xml:space="preserve">do-while </w:t>
       </w:r>
     </w:p>
     <w:p>
@@ -456,7 +414,7 @@
     <w:p>
       <w:r>
         <w:pict w14:anchorId="4DC541F9">
-          <v:rect id="_x0000_i1028" style="width:0;height:1.5pt" o:hralign="center" o:hrstd="t" o:hr="t" fillcolor="#a0a0a0" stroked="f"/>
+          <v:rect id="_x0000_i1029" style="width:0;height:1.5pt" o:hralign="center" o:hrstd="t" o:hr="t" fillcolor="#a0a0a0" stroked="f"/>
         </w:pict>
       </w:r>
     </w:p>
@@ -550,7 +508,7 @@
     <w:p>
       <w:r>
         <w:pict w14:anchorId="2380DA54">
-          <v:rect id="_x0000_i1029" style="width:0;height:1.5pt" o:hralign="center" o:bullet="t" o:hrstd="t" o:hr="t" fillcolor="#a0a0a0" stroked="f"/>
+          <v:rect id="_x0000_i1030" style="width:0;height:1.5pt" o:hralign="center" o:bullet="t" o:hrstd="t" o:hr="t" fillcolor="#a0a0a0" stroked="f"/>
         </w:pict>
       </w:r>
     </w:p>
@@ -577,13 +535,8 @@
         </w:numPr>
         <w:spacing w:after="0"/>
       </w:pPr>
-      <w:proofErr w:type="spellStart"/>
-      <w:r>
-        <w:t>Arrays</w:t>
-      </w:r>
-      <w:proofErr w:type="spellEnd"/>
-      <w:r>
-        <w:t xml:space="preserve"> unidimensionais </w:t>
+      <w:r>
+        <w:t xml:space="preserve">Arrays unidimensionais </w:t>
       </w:r>
     </w:p>
     <w:p>
@@ -594,13 +547,9 @@
         </w:numPr>
         <w:spacing w:after="0"/>
       </w:pPr>
-      <w:proofErr w:type="spellStart"/>
-      <w:r>
-        <w:t>Arrays</w:t>
-      </w:r>
-      <w:proofErr w:type="spellEnd"/>
-      <w:r>
-        <w:t xml:space="preserve"> bidimensionais </w:t>
+      <w:r>
+        <w:lastRenderedPageBreak/>
+        <w:t xml:space="preserve">Arrays bidimensionais </w:t>
       </w:r>
     </w:p>
     <w:p>
@@ -612,7 +561,6 @@
         <w:spacing w:after="0"/>
       </w:pPr>
       <w:r>
-        <w:lastRenderedPageBreak/>
         <w:t xml:space="preserve">Percorrendo vetores </w:t>
       </w:r>
     </w:p>
@@ -643,7 +591,7 @@
     <w:p>
       <w:r>
         <w:pict w14:anchorId="21449F6F">
-          <v:rect id="_x0000_i1030" style="width:0;height:1.5pt" o:hralign="center" o:hrstd="t" o:hr="t" fillcolor="#a0a0a0" stroked="f"/>
+          <v:rect id="_x0000_i1031" style="width:0;height:1.5pt" o:hralign="center" o:hrstd="t" o:hr="t" fillcolor="#a0a0a0" stroked="f"/>
         </w:pict>
       </w:r>
     </w:p>
@@ -659,17 +607,8 @@
           <w:b/>
           <w:bCs/>
         </w:rPr>
-        <w:t xml:space="preserve">Módulo 7 – </w:t>
-      </w:r>
-      <w:proofErr w:type="spellStart"/>
-      <w:r>
-        <w:rPr>
-          <w:b/>
-          <w:bCs/>
-        </w:rPr>
-        <w:t>Strings</w:t>
-      </w:r>
-      <w:proofErr w:type="spellEnd"/>
+        <w:t>Módulo 7 – Strings</w:t>
+      </w:r>
     </w:p>
     <w:p>
       <w:pPr>
@@ -692,15 +631,7 @@
         <w:spacing w:after="0"/>
       </w:pPr>
       <w:r>
-        <w:t>Biblioteca &lt;</w:t>
-      </w:r>
-      <w:proofErr w:type="spellStart"/>
-      <w:r>
-        <w:t>string.h</w:t>
-      </w:r>
-      <w:proofErr w:type="spellEnd"/>
-      <w:r>
-        <w:t xml:space="preserve">&gt; </w:t>
+        <w:t xml:space="preserve">Biblioteca &lt;string.h&gt; </w:t>
       </w:r>
     </w:p>
     <w:p>
@@ -711,13 +642,8 @@
         </w:numPr>
         <w:spacing w:after="0"/>
       </w:pPr>
-      <w:proofErr w:type="spellStart"/>
-      <w:r>
-        <w:t>strcpy</w:t>
-      </w:r>
-      <w:proofErr w:type="spellEnd"/>
-      <w:r>
-        <w:t xml:space="preserve"> </w:t>
+      <w:r>
+        <w:t xml:space="preserve">strcpy </w:t>
       </w:r>
     </w:p>
     <w:p>
@@ -728,13 +654,8 @@
         </w:numPr>
         <w:spacing w:after="0"/>
       </w:pPr>
-      <w:proofErr w:type="spellStart"/>
-      <w:r>
-        <w:t>strcat</w:t>
-      </w:r>
-      <w:proofErr w:type="spellEnd"/>
-      <w:r>
-        <w:t xml:space="preserve"> </w:t>
+      <w:r>
+        <w:t xml:space="preserve">strcat </w:t>
       </w:r>
     </w:p>
     <w:p>
@@ -745,13 +666,8 @@
         </w:numPr>
         <w:spacing w:after="0"/>
       </w:pPr>
-      <w:proofErr w:type="spellStart"/>
-      <w:r>
-        <w:t>strcmp</w:t>
-      </w:r>
-      <w:proofErr w:type="spellEnd"/>
-      <w:r>
-        <w:t xml:space="preserve"> </w:t>
+      <w:r>
+        <w:t xml:space="preserve">strcmp </w:t>
       </w:r>
     </w:p>
     <w:p>
@@ -762,19 +678,14 @@
         </w:numPr>
         <w:spacing w:after="0"/>
       </w:pPr>
-      <w:proofErr w:type="spellStart"/>
-      <w:r>
-        <w:t>strlen</w:t>
-      </w:r>
-      <w:proofErr w:type="spellEnd"/>
-      <w:r>
-        <w:t xml:space="preserve"> </w:t>
+      <w:r>
+        <w:t xml:space="preserve">strlen </w:t>
       </w:r>
     </w:p>
     <w:p>
       <w:r>
         <w:pict w14:anchorId="60A533C6">
-          <v:rect id="_x0000_i1031" style="width:0;height:1.5pt" o:hralign="center" o:hrstd="t" o:hr="t" fillcolor="#a0a0a0" stroked="f"/>
+          <v:rect id="_x0000_i1032" style="width:0;height:1.5pt" o:hralign="center" o:hrstd="t" o:hr="t" fillcolor="#a0a0a0" stroked="f"/>
         </w:pict>
       </w:r>
     </w:p>
@@ -865,15 +776,7 @@
         <w:spacing w:after="0"/>
       </w:pPr>
       <w:r>
-        <w:t xml:space="preserve">Relação entre </w:t>
-      </w:r>
-      <w:proofErr w:type="spellStart"/>
-      <w:r>
-        <w:t>arrays</w:t>
-      </w:r>
-      <w:proofErr w:type="spellEnd"/>
-      <w:r>
-        <w:t xml:space="preserve"> e ponteiros</w:t>
+        <w:t>Relação entre arrays e ponteiros</w:t>
       </w:r>
     </w:p>
     <w:p/>
@@ -891,7 +794,7 @@
 <w:numbering xmlns:wpc="http://schemas.microsoft.com/office/word/2010/wordprocessingCanvas" xmlns:cx="http://schemas.microsoft.com/office/drawing/2014/chartex" xmlns:cx1="http://schemas.microsoft.com/office/drawing/2015/9/8/chartex" xmlns:cx2="http://schemas.microsoft.com/office/drawing/2015/10/21/chartex" xmlns:cx3="http://schemas.microsoft.com/office/drawing/2016/5/9/chartex" xmlns:cx4="http://schemas.microsoft.com/office/drawing/2016/5/10/chartex" xmlns:cx5="http://schemas.microsoft.com/office/drawing/2016/5/11/chartex" xmlns:cx6="http://schemas.microsoft.com/office/drawing/2016/5/12/chartex" xmlns:cx7="http://schemas.microsoft.com/office/drawing/2016/5/13/chartex" xmlns:cx8="http://schemas.microsoft.com/office/drawing/2016/5/14/chartex" xmlns:mc="http://schemas.openxmlformats.org/markup-compatibility/2006" xmlns:aink="http://schemas.microsoft.com/office/drawing/2016/ink" xmlns:am3d="http://schemas.microsoft.com/office/drawing/2017/model3d" xmlns:o="urn:schemas-microsoft-com:office:office" xmlns:oel="http://schemas.microsoft.com/office/2019/extlst" xmlns:r="http://schemas.openxmlformats.org/officeDocument/2006/relationships" xmlns:m="http://schemas.openxmlformats.org/officeDocument/2006/math" xmlns:v="urn:schemas-microsoft-com:vml" xmlns:wp14="http://schemas.microsoft.com/office/word/2010/wordprocessingDrawing" xmlns:wp="http://schemas.openxmlformats.org/drawingml/2006/wordprocessingDrawing" xmlns:w10="urn:schemas-microsoft-com:office:word" xmlns:w="http://schemas.openxmlformats.org/wordprocessingml/2006/main" xmlns:w14="http://schemas.microsoft.com/office/word/2010/wordml" xmlns:w15="http://schemas.microsoft.com/office/word/2012/wordml" xmlns:w16cex="http://schemas.microsoft.com/office/word/2018/wordml/cex" xmlns:w16cid="http://schemas.microsoft.com/office/word/2016/wordml/cid" xmlns:w16="http://schemas.microsoft.com/office/word/2018/wordml" xmlns:w16du="http://schemas.microsoft.com/office/word/2023/wordml/word16du" xmlns:w16sdtdh="http://schemas.microsoft.com/office/word/2020/wordml/sdtdatahash" xmlns:w16sdtfl="http://schemas.microsoft.com/office/word/2024/wordml/sdtformatlock" xmlns:w16se="http://schemas.microsoft.com/office/word/2015/wordml/symex" xmlns:wpg="http://schemas.microsoft.com/office/word/2010/wordprocessingGroup" xmlns:wpi="http://schemas.microsoft.com/office/word/2010/wordprocessingInk" xmlns:wne="http://schemas.microsoft.com/office/word/2006/wordml" xmlns:wps="http://schemas.microsoft.com/office/word/2010/wordprocessingShape" mc:Ignorable="w14 w15 w16se w16cid w16 w16cex w16sdtdh w16sdtfl w16du wp14">
   <w:numPicBullet w:numPicBulletId="0">
     <w:pict>
-      <v:rect id="_x0000_i1028" style="width:0;height:1.5pt" o:hralign="center" o:bullet="t" o:hrstd="t" o:hr="t" fillcolor="#a0a0a0" stroked="f"/>
+      <v:rect id="_x0000_i1027" style="width:0;height:1.5pt" o:hralign="center" o:bullet="t" o:hrstd="t" o:hr="t" fillcolor="#a0a0a0" stroked="f"/>
     </w:pict>
   </w:numPicBullet>
   <w:abstractNum w:abstractNumId="0" w15:restartNumberingAfterBreak="0">

</xml_diff>

<commit_message>
Correção do conteúdo de LP
</commit_message>
<xml_diff>
--- a/UNIUBE-LP/Conteudo.docx
+++ b/UNIUBE-LP/Conteudo.docx
@@ -198,6 +198,9 @@
       <w:r>
         <w:t xml:space="preserve">Operadores </w:t>
       </w:r>
+      <w:r>
+        <w:t>lógicos, aritméticos e relacionais</w:t>
+      </w:r>
     </w:p>
     <w:p>
       <w:pPr>
@@ -208,18 +211,6 @@
         <w:spacing w:after="0"/>
       </w:pPr>
       <w:r>
-        <w:t xml:space="preserve">Entrada e saída (printf e scanf) </w:t>
-      </w:r>
-    </w:p>
-    <w:p>
-      <w:pPr>
-        <w:numPr>
-          <w:ilvl w:val="0"/>
-          <w:numId w:val="10"/>
-        </w:numPr>
-        <w:spacing w:after="0"/>
-      </w:pPr>
-      <w:r>
         <w:t xml:space="preserve">Conversão de tipos (casting) </w:t>
       </w:r>
     </w:p>
@@ -244,6 +235,13 @@
         </w:rPr>
         <w:t>Módulo 3 – Estruturas de Decisão</w:t>
       </w:r>
+      <w:r>
+        <w:rPr>
+          <w:b/>
+          <w:bCs/>
+        </w:rPr>
+        <w:t xml:space="preserve"> e I/O</w:t>
+      </w:r>
     </w:p>
     <w:p>
       <w:pPr>
@@ -254,7 +252,7 @@
         <w:spacing w:after="0"/>
       </w:pPr>
       <w:r>
-        <w:t xml:space="preserve">if </w:t>
+        <w:t xml:space="preserve">Entrada e saída (printf e scanf) </w:t>
       </w:r>
     </w:p>
     <w:p>
@@ -266,7 +264,7 @@
         <w:spacing w:after="0"/>
       </w:pPr>
       <w:r>
-        <w:t xml:space="preserve">if-else </w:t>
+        <w:t xml:space="preserve">if </w:t>
       </w:r>
     </w:p>
     <w:p>
@@ -278,7 +276,7 @@
         <w:spacing w:after="0"/>
       </w:pPr>
       <w:r>
-        <w:t xml:space="preserve">else-if </w:t>
+        <w:t xml:space="preserve">if-else </w:t>
       </w:r>
     </w:p>
     <w:p>
@@ -290,7 +288,7 @@
         <w:spacing w:after="0"/>
       </w:pPr>
       <w:r>
-        <w:t xml:space="preserve">switch-case </w:t>
+        <w:t xml:space="preserve">else-if </w:t>
       </w:r>
     </w:p>
     <w:p>
@@ -302,19 +300,7 @@
         <w:spacing w:after="0"/>
       </w:pPr>
       <w:r>
-        <w:t xml:space="preserve">Operadores relacionais </w:t>
-      </w:r>
-    </w:p>
-    <w:p>
-      <w:pPr>
-        <w:numPr>
-          <w:ilvl w:val="0"/>
-          <w:numId w:val="11"/>
-        </w:numPr>
-        <w:spacing w:after="0"/>
-      </w:pPr>
-      <w:r>
-        <w:t xml:space="preserve">Operadores lógicos </w:t>
+        <w:t xml:space="preserve">switch-case </w:t>
       </w:r>
     </w:p>
     <w:p>
@@ -548,7 +534,6 @@
         <w:spacing w:after="0"/>
       </w:pPr>
       <w:r>
-        <w:lastRenderedPageBreak/>
         <w:t xml:space="preserve">Arrays bidimensionais </w:t>
       </w:r>
     </w:p>
@@ -573,6 +558,7 @@
         <w:spacing w:after="0"/>
       </w:pPr>
       <w:r>
+        <w:lastRenderedPageBreak/>
         <w:t xml:space="preserve">Busca simples </w:t>
       </w:r>
     </w:p>

</xml_diff>

<commit_message>
Atualização de aulas de LP 13/08
</commit_message>
<xml_diff>
--- a/UNIUBE-LP/Conteudo.docx
+++ b/UNIUBE-LP/Conteudo.docx
@@ -215,6 +215,18 @@
       </w:r>
     </w:p>
     <w:p>
+      <w:pPr>
+        <w:numPr>
+          <w:ilvl w:val="0"/>
+          <w:numId w:val="10"/>
+        </w:numPr>
+        <w:spacing w:after="0"/>
+      </w:pPr>
+      <w:r>
+        <w:t xml:space="preserve">Entrada e saída (printf e scanf) </w:t>
+      </w:r>
+    </w:p>
+    <w:p>
       <w:r>
         <w:pict w14:anchorId="624FA6B7">
           <v:rect id="_x0000_i1027" style="width:0;height:1.5pt" o:hralign="center" o:hrstd="t" o:hr="t" fillcolor="#a0a0a0" stroked="f"/>
@@ -252,7 +264,7 @@
         <w:spacing w:after="0"/>
       </w:pPr>
       <w:r>
-        <w:t xml:space="preserve">Entrada e saída (printf e scanf) </w:t>
+        <w:t xml:space="preserve">if </w:t>
       </w:r>
     </w:p>
     <w:p>
@@ -264,7 +276,7 @@
         <w:spacing w:after="0"/>
       </w:pPr>
       <w:r>
-        <w:t xml:space="preserve">if </w:t>
+        <w:t xml:space="preserve">if-else </w:t>
       </w:r>
     </w:p>
     <w:p>
@@ -276,7 +288,7 @@
         <w:spacing w:after="0"/>
       </w:pPr>
       <w:r>
-        <w:t xml:space="preserve">if-else </w:t>
+        <w:t xml:space="preserve">else-if </w:t>
       </w:r>
     </w:p>
     <w:p>
@@ -288,18 +300,6 @@
         <w:spacing w:after="0"/>
       </w:pPr>
       <w:r>
-        <w:t xml:space="preserve">else-if </w:t>
-      </w:r>
-    </w:p>
-    <w:p>
-      <w:pPr>
-        <w:numPr>
-          <w:ilvl w:val="0"/>
-          <w:numId w:val="11"/>
-        </w:numPr>
-        <w:spacing w:after="0"/>
-      </w:pPr>
-      <w:r>
         <w:t xml:space="preserve">switch-case </w:t>
       </w:r>
     </w:p>
@@ -370,7 +370,10 @@
         <w:spacing w:after="0"/>
       </w:pPr>
       <w:r>
-        <w:t xml:space="preserve">break </w:t>
+        <w:t xml:space="preserve">continue </w:t>
+      </w:r>
+      <w:r>
+        <w:t>e break</w:t>
       </w:r>
     </w:p>
     <w:p>
@@ -382,18 +385,6 @@
         <w:spacing w:after="0"/>
       </w:pPr>
       <w:r>
-        <w:t xml:space="preserve">continue </w:t>
-      </w:r>
-    </w:p>
-    <w:p>
-      <w:pPr>
-        <w:numPr>
-          <w:ilvl w:val="0"/>
-          <w:numId w:val="12"/>
-        </w:numPr>
-        <w:spacing w:after="0"/>
-      </w:pPr>
-      <w:r>
         <w:t xml:space="preserve">Laços aninhados </w:t>
       </w:r>
     </w:p>
@@ -558,7 +549,6 @@
         <w:spacing w:after="0"/>
       </w:pPr>
       <w:r>
-        <w:lastRenderedPageBreak/>
         <w:t xml:space="preserve">Busca simples </w:t>
       </w:r>
     </w:p>
@@ -571,6 +561,7 @@
         <w:spacing w:after="0"/>
       </w:pPr>
       <w:r>
+        <w:lastRenderedPageBreak/>
         <w:t>Ordenação básica</w:t>
       </w:r>
     </w:p>
@@ -780,7 +771,7 @@
 <w:numbering xmlns:wpc="http://schemas.microsoft.com/office/word/2010/wordprocessingCanvas" xmlns:cx="http://schemas.microsoft.com/office/drawing/2014/chartex" xmlns:cx1="http://schemas.microsoft.com/office/drawing/2015/9/8/chartex" xmlns:cx2="http://schemas.microsoft.com/office/drawing/2015/10/21/chartex" xmlns:cx3="http://schemas.microsoft.com/office/drawing/2016/5/9/chartex" xmlns:cx4="http://schemas.microsoft.com/office/drawing/2016/5/10/chartex" xmlns:cx5="http://schemas.microsoft.com/office/drawing/2016/5/11/chartex" xmlns:cx6="http://schemas.microsoft.com/office/drawing/2016/5/12/chartex" xmlns:cx7="http://schemas.microsoft.com/office/drawing/2016/5/13/chartex" xmlns:cx8="http://schemas.microsoft.com/office/drawing/2016/5/14/chartex" xmlns:mc="http://schemas.openxmlformats.org/markup-compatibility/2006" xmlns:aink="http://schemas.microsoft.com/office/drawing/2016/ink" xmlns:am3d="http://schemas.microsoft.com/office/drawing/2017/model3d" xmlns:o="urn:schemas-microsoft-com:office:office" xmlns:oel="http://schemas.microsoft.com/office/2019/extlst" xmlns:r="http://schemas.openxmlformats.org/officeDocument/2006/relationships" xmlns:m="http://schemas.openxmlformats.org/officeDocument/2006/math" xmlns:v="urn:schemas-microsoft-com:vml" xmlns:wp14="http://schemas.microsoft.com/office/word/2010/wordprocessingDrawing" xmlns:wp="http://schemas.openxmlformats.org/drawingml/2006/wordprocessingDrawing" xmlns:w10="urn:schemas-microsoft-com:office:word" xmlns:w="http://schemas.openxmlformats.org/wordprocessingml/2006/main" xmlns:w14="http://schemas.microsoft.com/office/word/2010/wordml" xmlns:w15="http://schemas.microsoft.com/office/word/2012/wordml" xmlns:w16cex="http://schemas.microsoft.com/office/word/2018/wordml/cex" xmlns:w16cid="http://schemas.microsoft.com/office/word/2016/wordml/cid" xmlns:w16="http://schemas.microsoft.com/office/word/2018/wordml" xmlns:w16du="http://schemas.microsoft.com/office/word/2023/wordml/word16du" xmlns:w16sdtdh="http://schemas.microsoft.com/office/word/2020/wordml/sdtdatahash" xmlns:w16sdtfl="http://schemas.microsoft.com/office/word/2024/wordml/sdtformatlock" xmlns:w16se="http://schemas.microsoft.com/office/word/2015/wordml/symex" xmlns:wpg="http://schemas.microsoft.com/office/word/2010/wordprocessingGroup" xmlns:wpi="http://schemas.microsoft.com/office/word/2010/wordprocessingInk" xmlns:wne="http://schemas.microsoft.com/office/word/2006/wordml" xmlns:wps="http://schemas.microsoft.com/office/word/2010/wordprocessingShape" mc:Ignorable="w14 w15 w16se w16cid w16 w16cex w16sdtdh w16sdtfl w16du wp14">
   <w:numPicBullet w:numPicBulletId="0">
     <w:pict>
-      <v:rect id="_x0000_i1027" style="width:0;height:1.5pt" o:hralign="center" o:bullet="t" o:hrstd="t" o:hr="t" fillcolor="#a0a0a0" stroked="f"/>
+      <v:rect id="_x0000_i1029" style="width:0;height:1.5pt" o:hralign="center" o:bullet="t" o:hrstd="t" o:hr="t" fillcolor="#a0a0a0" stroked="f"/>
     </w:pict>
   </w:numPicBullet>
   <w:abstractNum w:abstractNumId="0" w15:restartNumberingAfterBreak="0">

</xml_diff>

<commit_message>
Atualização de conteúdo LP
</commit_message>
<xml_diff>
--- a/UNIUBE-LP/Conteudo.docx
+++ b/UNIUBE-LP/Conteudo.docx
@@ -2,6 +2,21 @@
 <file path=word/document.xml><?xml version="1.0" encoding="utf-8"?>
 <w:document xmlns:wpc="http://schemas.microsoft.com/office/word/2010/wordprocessingCanvas" xmlns:cx="http://schemas.microsoft.com/office/drawing/2014/chartex" xmlns:cx1="http://schemas.microsoft.com/office/drawing/2015/9/8/chartex" xmlns:cx2="http://schemas.microsoft.com/office/drawing/2015/10/21/chartex" xmlns:cx3="http://schemas.microsoft.com/office/drawing/2016/5/9/chartex" xmlns:cx4="http://schemas.microsoft.com/office/drawing/2016/5/10/chartex" xmlns:cx5="http://schemas.microsoft.com/office/drawing/2016/5/11/chartex" xmlns:cx6="http://schemas.microsoft.com/office/drawing/2016/5/12/chartex" xmlns:cx7="http://schemas.microsoft.com/office/drawing/2016/5/13/chartex" xmlns:cx8="http://schemas.microsoft.com/office/drawing/2016/5/14/chartex" xmlns:mc="http://schemas.openxmlformats.org/markup-compatibility/2006" xmlns:aink="http://schemas.microsoft.com/office/drawing/2016/ink" xmlns:am3d="http://schemas.microsoft.com/office/drawing/2017/model3d" xmlns:o="urn:schemas-microsoft-com:office:office" xmlns:oel="http://schemas.microsoft.com/office/2019/extlst" xmlns:r="http://schemas.openxmlformats.org/officeDocument/2006/relationships" xmlns:m="http://schemas.openxmlformats.org/officeDocument/2006/math" xmlns:v="urn:schemas-microsoft-com:vml" xmlns:wp14="http://schemas.microsoft.com/office/word/2010/wordprocessingDrawing" xmlns:wp="http://schemas.openxmlformats.org/drawingml/2006/wordprocessingDrawing" xmlns:w10="urn:schemas-microsoft-com:office:word" xmlns:w="http://schemas.openxmlformats.org/wordprocessingml/2006/main" xmlns:w14="http://schemas.microsoft.com/office/word/2010/wordml" xmlns:w15="http://schemas.microsoft.com/office/word/2012/wordml" xmlns:w16cex="http://schemas.microsoft.com/office/word/2018/wordml/cex" xmlns:w16cid="http://schemas.microsoft.com/office/word/2016/wordml/cid" xmlns:w16="http://schemas.microsoft.com/office/word/2018/wordml" xmlns:w16du="http://schemas.microsoft.com/office/word/2023/wordml/word16du" xmlns:w16sdtdh="http://schemas.microsoft.com/office/word/2020/wordml/sdtdatahash" xmlns:w16sdtfl="http://schemas.microsoft.com/office/word/2024/wordml/sdtformatlock" xmlns:w16se="http://schemas.microsoft.com/office/word/2015/wordml/symex" xmlns:wpg="http://schemas.microsoft.com/office/word/2010/wordprocessingGroup" xmlns:wpi="http://schemas.microsoft.com/office/word/2010/wordprocessingInk" xmlns:wne="http://schemas.microsoft.com/office/word/2006/wordml" xmlns:wps="http://schemas.microsoft.com/office/word/2010/wordprocessingShape" mc:Ignorable="w14 w15 w16se w16cid w16 w16cex w16sdtdh w16sdtfl w16du wp14">
   <w:body>
+    <w:p>
+      <w:pPr>
+        <w:rPr>
+          <w:b/>
+          <w:bCs/>
+        </w:rPr>
+      </w:pPr>
+      <w:r>
+        <w:rPr>
+          <w:b/>
+          <w:bCs/>
+        </w:rPr>
+        <w:t>PRIMEIRO MOMENTO:</w:t>
+      </w:r>
+    </w:p>
     <w:p>
       <w:pPr>
         <w:rPr>
@@ -36,7 +51,15 @@
         <w:t>Linguagens de programação</w:t>
       </w:r>
       <w:r>
-        <w:t>/Pseudo-Código /Algoritmos</w:t>
+        <w:t>/</w:t>
+      </w:r>
+      <w:proofErr w:type="spellStart"/>
+      <w:r>
+        <w:t>Pseudo-Código</w:t>
+      </w:r>
+      <w:proofErr w:type="spellEnd"/>
+      <w:r>
+        <w:t xml:space="preserve"> /Algoritmos</w:t>
       </w:r>
     </w:p>
     <w:p>
@@ -76,11 +99,10 @@
       </w:r>
     </w:p>
     <w:p>
-      <w:r>
-        <w:pict w14:anchorId="58E19CF7">
-          <v:rect id="_x0000_i1026" style="width:0;height:1.5pt" o:hralign="center" o:hrstd="t" o:hr="t" fillcolor="#a0a0a0" stroked="f"/>
-        </w:pict>
-      </w:r>
+      <w:pPr>
+        <w:spacing w:after="0"/>
+        <w:ind w:left="720"/>
+      </w:pPr>
     </w:p>
     <w:p>
       <w:pPr>
@@ -125,24 +147,7 @@
         <w:spacing w:after="0"/>
       </w:pPr>
       <w:r>
-        <w:t>Ambiente de Desenvolvimento</w:t>
-      </w:r>
-      <w:r>
-        <w:t xml:space="preserve"> – </w:t>
-      </w:r>
-      <w:r>
-        <w:rPr>
-          <w:b/>
-          <w:bCs/>
-        </w:rPr>
-        <w:t>DevC</w:t>
-      </w:r>
-      <w:r>
-        <w:rPr>
-          <w:b/>
-          <w:bCs/>
-        </w:rPr>
-        <w:t>++</w:t>
+        <w:t>Palavras reservadas</w:t>
       </w:r>
     </w:p>
     <w:p>
@@ -154,7 +159,13 @@
         <w:spacing w:after="0"/>
       </w:pPr>
       <w:r>
-        <w:t>Palavras reservadas</w:t>
+        <w:t xml:space="preserve">Variáveis </w:t>
+      </w:r>
+      <w:r>
+        <w:t xml:space="preserve">e </w:t>
+      </w:r>
+      <w:r>
+        <w:t xml:space="preserve">Constantes </w:t>
       </w:r>
     </w:p>
     <w:p>
@@ -166,13 +177,7 @@
         <w:spacing w:after="0"/>
       </w:pPr>
       <w:r>
-        <w:t xml:space="preserve">Variáveis </w:t>
-      </w:r>
-      <w:r>
-        <w:t xml:space="preserve">e </w:t>
-      </w:r>
-      <w:r>
-        <w:t xml:space="preserve">Constantes </w:t>
+        <w:t xml:space="preserve">Tipos primitivos </w:t>
       </w:r>
     </w:p>
     <w:p>
@@ -184,7 +189,10 @@
         <w:spacing w:after="0"/>
       </w:pPr>
       <w:r>
-        <w:t xml:space="preserve">Tipos primitivos </w:t>
+        <w:t xml:space="preserve">Operadores </w:t>
+      </w:r>
+      <w:r>
+        <w:t>lógicos, aritméticos e relacionais</w:t>
       </w:r>
     </w:p>
     <w:p>
@@ -196,10 +204,7 @@
         <w:spacing w:after="0"/>
       </w:pPr>
       <w:r>
-        <w:t xml:space="preserve">Operadores </w:t>
-      </w:r>
-      <w:r>
-        <w:t>lógicos, aritméticos e relacionais</w:t>
+        <w:t xml:space="preserve">Conversão de tipos (casting) </w:t>
       </w:r>
     </w:p>
     <w:p>
@@ -211,27 +216,30 @@
         <w:spacing w:after="0"/>
       </w:pPr>
       <w:r>
-        <w:t xml:space="preserve">Conversão de tipos (casting) </w:t>
-      </w:r>
-    </w:p>
-    <w:p>
-      <w:pPr>
-        <w:numPr>
-          <w:ilvl w:val="0"/>
-          <w:numId w:val="10"/>
-        </w:numPr>
+        <w:t>Entrada e saída (</w:t>
+      </w:r>
+      <w:proofErr w:type="spellStart"/>
+      <w:r>
+        <w:t>printf</w:t>
+      </w:r>
+      <w:proofErr w:type="spellEnd"/>
+      <w:r>
+        <w:t xml:space="preserve"> e </w:t>
+      </w:r>
+      <w:proofErr w:type="spellStart"/>
+      <w:r>
+        <w:t>scanf</w:t>
+      </w:r>
+      <w:proofErr w:type="spellEnd"/>
+      <w:r>
+        <w:t xml:space="preserve">) </w:t>
+      </w:r>
+    </w:p>
+    <w:p>
+      <w:pPr>
         <w:spacing w:after="0"/>
-      </w:pPr>
-      <w:r>
-        <w:t xml:space="preserve">Entrada e saída (printf e scanf) </w:t>
-      </w:r>
-    </w:p>
-    <w:p>
-      <w:r>
-        <w:pict w14:anchorId="624FA6B7">
-          <v:rect id="_x0000_i1027" style="width:0;height:1.5pt" o:hralign="center" o:hrstd="t" o:hr="t" fillcolor="#a0a0a0" stroked="f"/>
-        </w:pict>
-      </w:r>
+        <w:ind w:left="720"/>
+      </w:pPr>
     </w:p>
     <w:p>
       <w:pPr>
@@ -263,8 +271,13 @@
         </w:numPr>
         <w:spacing w:after="0"/>
       </w:pPr>
-      <w:r>
-        <w:t xml:space="preserve">if </w:t>
+      <w:proofErr w:type="spellStart"/>
+      <w:r>
+        <w:t>if</w:t>
+      </w:r>
+      <w:proofErr w:type="spellEnd"/>
+      <w:r>
+        <w:t xml:space="preserve"> </w:t>
       </w:r>
     </w:p>
     <w:p>
@@ -275,8 +288,13 @@
         </w:numPr>
         <w:spacing w:after="0"/>
       </w:pPr>
-      <w:r>
-        <w:t xml:space="preserve">if-else </w:t>
+      <w:proofErr w:type="spellStart"/>
+      <w:r>
+        <w:t>if-else</w:t>
+      </w:r>
+      <w:proofErr w:type="spellEnd"/>
+      <w:r>
+        <w:t xml:space="preserve"> </w:t>
       </w:r>
     </w:p>
     <w:p>
@@ -287,8 +305,13 @@
         </w:numPr>
         <w:spacing w:after="0"/>
       </w:pPr>
-      <w:r>
-        <w:t xml:space="preserve">else-if </w:t>
+      <w:proofErr w:type="spellStart"/>
+      <w:r>
+        <w:t>else-if</w:t>
+      </w:r>
+      <w:proofErr w:type="spellEnd"/>
+      <w:r>
+        <w:t xml:space="preserve"> </w:t>
       </w:r>
     </w:p>
     <w:p>
@@ -304,11 +327,10 @@
       </w:r>
     </w:p>
     <w:p>
-      <w:r>
-        <w:pict w14:anchorId="24BBA568">
-          <v:rect id="_x0000_i1028" style="width:0;height:1.5pt" o:hralign="center" o:hrstd="t" o:hr="t" fillcolor="#a0a0a0" stroked="f"/>
-        </w:pict>
-      </w:r>
+      <w:pPr>
+        <w:spacing w:after="0"/>
+        <w:ind w:left="720"/>
+      </w:pPr>
     </w:p>
     <w:p>
       <w:pPr>
@@ -333,8 +355,13 @@
         </w:numPr>
         <w:spacing w:after="0"/>
       </w:pPr>
-      <w:r>
-        <w:t xml:space="preserve">while </w:t>
+      <w:proofErr w:type="spellStart"/>
+      <w:r>
+        <w:t>while</w:t>
+      </w:r>
+      <w:proofErr w:type="spellEnd"/>
+      <w:r>
+        <w:t xml:space="preserve"> </w:t>
       </w:r>
     </w:p>
     <w:p>
@@ -346,7 +373,15 @@
         <w:spacing w:after="0"/>
       </w:pPr>
       <w:r>
-        <w:t xml:space="preserve">do-while </w:t>
+        <w:t>do-</w:t>
+      </w:r>
+      <w:proofErr w:type="spellStart"/>
+      <w:r>
+        <w:t>while</w:t>
+      </w:r>
+      <w:proofErr w:type="spellEnd"/>
+      <w:r>
+        <w:t xml:space="preserve"> </w:t>
       </w:r>
     </w:p>
     <w:p>
@@ -361,38 +396,35 @@
         <w:t xml:space="preserve">for </w:t>
       </w:r>
     </w:p>
-    <w:p>
-      <w:pPr>
-        <w:numPr>
-          <w:ilvl w:val="0"/>
-          <w:numId w:val="12"/>
-        </w:numPr>
-        <w:spacing w:after="0"/>
-      </w:pPr>
-      <w:r>
-        <w:t xml:space="preserve">continue </w:t>
-      </w:r>
-      <w:r>
-        <w:t>e break</w:t>
-      </w:r>
-    </w:p>
-    <w:p>
-      <w:pPr>
-        <w:numPr>
-          <w:ilvl w:val="0"/>
-          <w:numId w:val="12"/>
-        </w:numPr>
-        <w:spacing w:after="0"/>
-      </w:pPr>
-      <w:r>
-        <w:t xml:space="preserve">Laços aninhados </w:t>
-      </w:r>
-    </w:p>
+    <w:p/>
     <w:p>
       <w:r>
         <w:pict w14:anchorId="4DC541F9">
           <v:rect id="_x0000_i1029" style="width:0;height:1.5pt" o:hralign="center" o:hrstd="t" o:hr="t" fillcolor="#a0a0a0" stroked="f"/>
         </w:pict>
+      </w:r>
+    </w:p>
+    <w:p/>
+    <w:p>
+      <w:pPr>
+        <w:rPr>
+          <w:b/>
+          <w:bCs/>
+        </w:rPr>
+      </w:pPr>
+      <w:r>
+        <w:rPr>
+          <w:b/>
+          <w:bCs/>
+        </w:rPr>
+        <w:t>SEGUNDO</w:t>
+      </w:r>
+      <w:r>
+        <w:rPr>
+          <w:b/>
+          <w:bCs/>
+        </w:rPr>
+        <w:t xml:space="preserve"> MOMENTO:</w:t>
       </w:r>
     </w:p>
     <w:p>
@@ -419,7 +451,7 @@
         <w:spacing w:after="0"/>
       </w:pPr>
       <w:r>
-        <w:t xml:space="preserve">Conceito de modularização </w:t>
+        <w:t>Estrutura das funções</w:t>
       </w:r>
     </w:p>
     <w:p>
@@ -431,7 +463,7 @@
         <w:spacing w:after="0"/>
       </w:pPr>
       <w:r>
-        <w:t xml:space="preserve">Declaração e definição </w:t>
+        <w:t>Modularização e chamada de funções</w:t>
       </w:r>
     </w:p>
     <w:p>
@@ -443,51 +475,14 @@
         <w:spacing w:after="0"/>
       </w:pPr>
       <w:r>
-        <w:t xml:space="preserve">Parâmetros </w:t>
-      </w:r>
-    </w:p>
-    <w:p>
-      <w:pPr>
-        <w:numPr>
-          <w:ilvl w:val="0"/>
-          <w:numId w:val="13"/>
-        </w:numPr>
+        <w:t xml:space="preserve">Recursão </w:t>
+      </w:r>
+    </w:p>
+    <w:p>
+      <w:pPr>
         <w:spacing w:after="0"/>
-      </w:pPr>
-      <w:r>
-        <w:t xml:space="preserve">Retorno </w:t>
-      </w:r>
-    </w:p>
-    <w:p>
-      <w:pPr>
-        <w:numPr>
-          <w:ilvl w:val="0"/>
-          <w:numId w:val="13"/>
-        </w:numPr>
-        <w:spacing w:after="0"/>
-      </w:pPr>
-      <w:r>
-        <w:t xml:space="preserve">Escopo de variáveis </w:t>
-      </w:r>
-    </w:p>
-    <w:p>
-      <w:pPr>
-        <w:numPr>
-          <w:ilvl w:val="0"/>
-          <w:numId w:val="13"/>
-        </w:numPr>
-        <w:spacing w:after="0"/>
-      </w:pPr>
-      <w:r>
-        <w:t xml:space="preserve">Recursão (introdução) </w:t>
-      </w:r>
-    </w:p>
-    <w:p>
-      <w:r>
-        <w:pict w14:anchorId="2380DA54">
-          <v:rect id="_x0000_i1030" style="width:0;height:1.5pt" o:hralign="center" o:bullet="t" o:hrstd="t" o:hr="t" fillcolor="#a0a0a0" stroked="f"/>
-        </w:pict>
-      </w:r>
+        <w:ind w:left="720"/>
+      </w:pPr>
     </w:p>
     <w:p>
       <w:pPr>
@@ -512,8 +507,13 @@
         </w:numPr>
         <w:spacing w:after="0"/>
       </w:pPr>
-      <w:r>
-        <w:t xml:space="preserve">Arrays unidimensionais </w:t>
+      <w:proofErr w:type="spellStart"/>
+      <w:r>
+        <w:t>Arrays</w:t>
+      </w:r>
+      <w:proofErr w:type="spellEnd"/>
+      <w:r>
+        <w:t xml:space="preserve"> unidimensionais </w:t>
       </w:r>
     </w:p>
     <w:p>
@@ -524,8 +524,13 @@
         </w:numPr>
         <w:spacing w:after="0"/>
       </w:pPr>
-      <w:r>
-        <w:t xml:space="preserve">Arrays bidimensionais </w:t>
+      <w:proofErr w:type="spellStart"/>
+      <w:r>
+        <w:t>Arrays</w:t>
+      </w:r>
+      <w:proofErr w:type="spellEnd"/>
+      <w:r>
+        <w:t xml:space="preserve"> bidimensionais </w:t>
       </w:r>
     </w:p>
     <w:p>
@@ -561,16 +566,14 @@
         <w:spacing w:after="0"/>
       </w:pPr>
       <w:r>
-        <w:lastRenderedPageBreak/>
         <w:t>Ordenação básica</w:t>
       </w:r>
     </w:p>
     <w:p>
-      <w:r>
-        <w:pict w14:anchorId="21449F6F">
-          <v:rect id="_x0000_i1031" style="width:0;height:1.5pt" o:hralign="center" o:hrstd="t" o:hr="t" fillcolor="#a0a0a0" stroked="f"/>
-        </w:pict>
-      </w:r>
+      <w:pPr>
+        <w:spacing w:after="0"/>
+        <w:ind w:left="720"/>
+      </w:pPr>
     </w:p>
     <w:p>
       <w:pPr>
@@ -584,8 +587,18 @@
           <w:b/>
           <w:bCs/>
         </w:rPr>
-        <w:t>Módulo 7 – Strings</w:t>
-      </w:r>
+        <w:lastRenderedPageBreak/>
+        <w:t xml:space="preserve">Módulo 7 – </w:t>
+      </w:r>
+      <w:proofErr w:type="spellStart"/>
+      <w:r>
+        <w:rPr>
+          <w:b/>
+          <w:bCs/>
+        </w:rPr>
+        <w:t>Strings</w:t>
+      </w:r>
+      <w:proofErr w:type="spellEnd"/>
     </w:p>
     <w:p>
       <w:pPr>
@@ -608,7 +621,15 @@
         <w:spacing w:after="0"/>
       </w:pPr>
       <w:r>
-        <w:t xml:space="preserve">Biblioteca &lt;string.h&gt; </w:t>
+        <w:t>Biblioteca &lt;</w:t>
+      </w:r>
+      <w:proofErr w:type="spellStart"/>
+      <w:r>
+        <w:t>string.h</w:t>
+      </w:r>
+      <w:proofErr w:type="spellEnd"/>
+      <w:r>
+        <w:t xml:space="preserve">&gt; </w:t>
       </w:r>
     </w:p>
     <w:p>
@@ -619,8 +640,13 @@
         </w:numPr>
         <w:spacing w:after="0"/>
       </w:pPr>
-      <w:r>
-        <w:t xml:space="preserve">strcpy </w:t>
+      <w:proofErr w:type="spellStart"/>
+      <w:r>
+        <w:t>strcpy</w:t>
+      </w:r>
+      <w:proofErr w:type="spellEnd"/>
+      <w:r>
+        <w:t xml:space="preserve"> </w:t>
       </w:r>
     </w:p>
     <w:p>
@@ -631,8 +657,13 @@
         </w:numPr>
         <w:spacing w:after="0"/>
       </w:pPr>
-      <w:r>
-        <w:t xml:space="preserve">strcat </w:t>
+      <w:proofErr w:type="spellStart"/>
+      <w:r>
+        <w:t>strcat</w:t>
+      </w:r>
+      <w:proofErr w:type="spellEnd"/>
+      <w:r>
+        <w:t xml:space="preserve"> </w:t>
       </w:r>
     </w:p>
     <w:p>
@@ -643,8 +674,13 @@
         </w:numPr>
         <w:spacing w:after="0"/>
       </w:pPr>
-      <w:r>
-        <w:t xml:space="preserve">strcmp </w:t>
+      <w:proofErr w:type="spellStart"/>
+      <w:r>
+        <w:t>strcmp</w:t>
+      </w:r>
+      <w:proofErr w:type="spellEnd"/>
+      <w:r>
+        <w:t xml:space="preserve"> </w:t>
       </w:r>
     </w:p>
     <w:p>
@@ -655,17 +691,16 @@
         </w:numPr>
         <w:spacing w:after="0"/>
       </w:pPr>
-      <w:r>
-        <w:t xml:space="preserve">strlen </w:t>
-      </w:r>
-    </w:p>
-    <w:p>
-      <w:r>
-        <w:pict w14:anchorId="60A533C6">
-          <v:rect id="_x0000_i1032" style="width:0;height:1.5pt" o:hralign="center" o:hrstd="t" o:hr="t" fillcolor="#a0a0a0" stroked="f"/>
-        </w:pict>
-      </w:r>
-    </w:p>
+      <w:proofErr w:type="spellStart"/>
+      <w:r>
+        <w:t>strlen</w:t>
+      </w:r>
+      <w:proofErr w:type="spellEnd"/>
+      <w:r>
+        <w:t xml:space="preserve"> </w:t>
+      </w:r>
+    </w:p>
+    <w:p/>
     <w:p>
       <w:pPr>
         <w:rPr>
@@ -753,7 +788,15 @@
         <w:spacing w:after="0"/>
       </w:pPr>
       <w:r>
-        <w:t>Relação entre arrays e ponteiros</w:t>
+        <w:t xml:space="preserve">Relação entre </w:t>
+      </w:r>
+      <w:proofErr w:type="spellStart"/>
+      <w:r>
+        <w:t>arrays</w:t>
+      </w:r>
+      <w:proofErr w:type="spellEnd"/>
+      <w:r>
+        <w:t xml:space="preserve"> e ponteiros</w:t>
       </w:r>
     </w:p>
     <w:p/>
@@ -771,7 +814,7 @@
 <w:numbering xmlns:wpc="http://schemas.microsoft.com/office/word/2010/wordprocessingCanvas" xmlns:cx="http://schemas.microsoft.com/office/drawing/2014/chartex" xmlns:cx1="http://schemas.microsoft.com/office/drawing/2015/9/8/chartex" xmlns:cx2="http://schemas.microsoft.com/office/drawing/2015/10/21/chartex" xmlns:cx3="http://schemas.microsoft.com/office/drawing/2016/5/9/chartex" xmlns:cx4="http://schemas.microsoft.com/office/drawing/2016/5/10/chartex" xmlns:cx5="http://schemas.microsoft.com/office/drawing/2016/5/11/chartex" xmlns:cx6="http://schemas.microsoft.com/office/drawing/2016/5/12/chartex" xmlns:cx7="http://schemas.microsoft.com/office/drawing/2016/5/13/chartex" xmlns:cx8="http://schemas.microsoft.com/office/drawing/2016/5/14/chartex" xmlns:mc="http://schemas.openxmlformats.org/markup-compatibility/2006" xmlns:aink="http://schemas.microsoft.com/office/drawing/2016/ink" xmlns:am3d="http://schemas.microsoft.com/office/drawing/2017/model3d" xmlns:o="urn:schemas-microsoft-com:office:office" xmlns:oel="http://schemas.microsoft.com/office/2019/extlst" xmlns:r="http://schemas.openxmlformats.org/officeDocument/2006/relationships" xmlns:m="http://schemas.openxmlformats.org/officeDocument/2006/math" xmlns:v="urn:schemas-microsoft-com:vml" xmlns:wp14="http://schemas.microsoft.com/office/word/2010/wordprocessingDrawing" xmlns:wp="http://schemas.openxmlformats.org/drawingml/2006/wordprocessingDrawing" xmlns:w10="urn:schemas-microsoft-com:office:word" xmlns:w="http://schemas.openxmlformats.org/wordprocessingml/2006/main" xmlns:w14="http://schemas.microsoft.com/office/word/2010/wordml" xmlns:w15="http://schemas.microsoft.com/office/word/2012/wordml" xmlns:w16cex="http://schemas.microsoft.com/office/word/2018/wordml/cex" xmlns:w16cid="http://schemas.microsoft.com/office/word/2016/wordml/cid" xmlns:w16="http://schemas.microsoft.com/office/word/2018/wordml" xmlns:w16du="http://schemas.microsoft.com/office/word/2023/wordml/word16du" xmlns:w16sdtdh="http://schemas.microsoft.com/office/word/2020/wordml/sdtdatahash" xmlns:w16sdtfl="http://schemas.microsoft.com/office/word/2024/wordml/sdtformatlock" xmlns:w16se="http://schemas.microsoft.com/office/word/2015/wordml/symex" xmlns:wpg="http://schemas.microsoft.com/office/word/2010/wordprocessingGroup" xmlns:wpi="http://schemas.microsoft.com/office/word/2010/wordprocessingInk" xmlns:wne="http://schemas.microsoft.com/office/word/2006/wordml" xmlns:wps="http://schemas.microsoft.com/office/word/2010/wordprocessingShape" mc:Ignorable="w14 w15 w16se w16cid w16 w16cex w16sdtdh w16sdtfl w16du wp14">
   <w:numPicBullet w:numPicBulletId="0">
     <w:pict>
-      <v:rect id="_x0000_i1029" style="width:0;height:1.5pt" o:hralign="center" o:bullet="t" o:hrstd="t" o:hr="t" fillcolor="#a0a0a0" stroked="f"/>
+      <v:rect id="_x0000_i1033" style="width:0;height:1.5pt" o:hralign="center" o:bullet="t" o:hrstd="t" o:hr="t" fillcolor="#a0a0a0" stroked="f"/>
     </w:pict>
   </w:numPicBullet>
   <w:abstractNum w:abstractNumId="0" w15:restartNumberingAfterBreak="0">

</xml_diff>